<commit_message>
feat: automate signed request dispatch workflow
Split arbitrary signed scan bundles by outgoing number, preserve repeated containers with stable suffixes, and support unrelated outgoing requests.

Generate portable Outlook draft packages, add extension workflow support, refresh request templates, and cover the complete flow with regression tests.
</commit_message>
<xml_diff>
--- a/NexusDocs/templates/requests/03_military_commissariat.docx
+++ b/NexusDocs/templates/requests/03_military_commissariat.docx
@@ -1105,24 +1105,6 @@
         <w:rPr>
           <w:rFonts w:eastAsia="MS Mincho"/>
           <w:bCs/>
-          <w:noProof/>
-          <w:sz w:val="26"/>
-          <w:szCs w:val="26"/>
-        </w:rPr>
-      </w:r>
-      <w:r>
-        <w:rPr>
-          <w:rFonts w:eastAsia="MS Mincho"/>
-          <w:bCs/>
-          <w:noProof/>
-          <w:sz w:val="26"/>
-          <w:szCs w:val="26"/>
-        </w:rPr>
-      </w:r>
-      <w:r>
-        <w:rPr>
-          <w:rFonts w:eastAsia="MS Mincho"/>
-          <w:bCs/>
           <w:sz w:val="26"/>
           <w:szCs w:val="26"/>
         </w:rPr>
@@ -1942,6 +1924,16 @@
         </w:rPr>
         <w:t>{{INITIALS}}</w:t>
       </w:r>
+      <w:r>
+        <w:rPr>
+          <w:rFonts w:eastAsia="Calibri"/>
+          <w:noProof/>
+          <w:sz w:val="26"/>
+          <w:szCs w:val="26"/>
+          <w:lang w:val="en-US"/>
+        </w:rPr>
+        <w:t>;</w:t>
+      </w:r>
     </w:p>
     <w:p>
       <w:pPr>
@@ -2137,7 +2129,23 @@
           <w:sz w:val="26"/>
           <w:szCs w:val="26"/>
         </w:rPr>
-        <w:t xml:space="preserve"> в связи с совершенным уклонением от прохождения военной службы в период </w:t>
+        <w:t xml:space="preserve"> в связи с совершенным уклонением от прохождения военной службы </w:t>
+      </w:r>
+      <w:r>
+        <w:rPr>
+          <w:rFonts w:eastAsia="Calibri"/>
+          <w:sz w:val="26"/>
+          <w:szCs w:val="26"/>
+        </w:rPr>
+        <w:br/>
+      </w:r>
+      <w:r>
+        <w:rPr>
+          <w:rFonts w:eastAsia="Calibri"/>
+          <w:sz w:val="26"/>
+          <w:szCs w:val="26"/>
+        </w:rPr>
+        <w:t xml:space="preserve">в период </w:t>
       </w:r>
       <w:r>
         <w:rPr>
@@ -2171,7 +2179,23 @@
           <w:sz w:val="26"/>
           <w:szCs w:val="26"/>
         </w:rPr>
-        <w:t xml:space="preserve">по настоящее время, а также принять исчерпывающие меры к установлению местонахождения </w:t>
+        <w:t xml:space="preserve">по настоящее время, а также принять исчерпывающие меры </w:t>
+      </w:r>
+      <w:r>
+        <w:rPr>
+          <w:rFonts w:eastAsia="Calibri"/>
+          <w:sz w:val="26"/>
+          <w:szCs w:val="26"/>
+        </w:rPr>
+        <w:br/>
+      </w:r>
+      <w:r>
+        <w:rPr>
+          <w:rFonts w:eastAsia="Calibri"/>
+          <w:sz w:val="26"/>
+          <w:szCs w:val="26"/>
+        </w:rPr>
+        <w:t xml:space="preserve">к установлению местонахождения </w:t>
       </w:r>
       <w:r>
         <w:rPr>
@@ -2200,6 +2224,8 @@
         </w:rPr>
         <w:t>{{INITIALS}}</w:t>
       </w:r>
+      <w:bookmarkStart w:id="0" w:name="_GoBack"/>
+      <w:bookmarkEnd w:id="0"/>
     </w:p>
     <w:p>
       <w:pPr>
@@ -2416,8 +2442,6 @@
         </w:rPr>
         <w:t xml:space="preserve">       </w:t>
       </w:r>
-      <w:bookmarkStart w:id="0" w:name="_GoBack"/>
-      <w:bookmarkEnd w:id="0"/>
       <w:r>
         <w:rPr>
           <w:rFonts w:eastAsia="Calibri"/>
@@ -2438,9 +2462,9 @@
       <w:proofErr w:type="spellEnd"/>
     </w:p>
     <w:sectPr>
-      <w:footerReference w:type="default" r:id="rId10"/>
-      <w:footerReference w:type="first" r:id="rId11"/>
-      <w:headerReference w:type="default" r:id="rId14"/>
+      <w:headerReference w:type="default" r:id="rId10"/>
+      <w:footerReference w:type="default" r:id="rId11"/>
+      <w:footerReference w:type="first" r:id="rId12"/>
       <w:pgSz w:w="11906" w:h="16838" w:code="9"/>
       <w:pgMar w:top="1418" w:right="567" w:bottom="1134" w:left="1418" w:header="0" w:footer="340" w:gutter="0"/>
       <w:cols w:space="708"/>
@@ -2504,6 +2528,7 @@
             <w:rPr>
               <w:sz w:val="16"/>
               <w:szCs w:val="16"/>
+              <w:lang w:val="en-US"/>
             </w:rPr>
           </w:pPr>
           <w:r>
@@ -2532,14 +2557,15 @@
               <w:sz w:val="16"/>
               <w:szCs w:val="16"/>
             </w:rPr>
-            <w:t>Исх. №</w:t>
+            <w:t xml:space="preserve">Исх. </w:t>
           </w:r>
           <w:r>
             <w:rPr>
               <w:sz w:val="16"/>
               <w:szCs w:val="16"/>
+              <w:lang w:val="en-US"/>
             </w:rPr>
-            <w:t xml:space="preserve"> </w:t>
+            <w:t xml:space="preserve">№ </w:t>
           </w:r>
           <w:proofErr w:type="spellStart"/>
           <w:r>
@@ -2554,6 +2580,7 @@
             <w:rPr>
               <w:sz w:val="18"/>
               <w:szCs w:val="16"/>
+              <w:lang w:val="en-US"/>
             </w:rPr>
             <w:t>-</w:t>
           </w:r>
@@ -2562,6 +2589,7 @@
               <w:noProof/>
               <w:sz w:val="18"/>
               <w:szCs w:val="16"/>
+              <w:lang w:val="en-US"/>
             </w:rPr>
             <w:t>{{OUTGOING_NUMBER}}</w:t>
           </w:r>
@@ -2569,22 +2597,9 @@
             <w:rPr>
               <w:sz w:val="18"/>
               <w:szCs w:val="16"/>
+              <w:lang w:val="en-US"/>
             </w:rPr>
-            <w:t>/</w:t>
-          </w:r>
-          <w:r>
-            <w:rPr>
-              <w:sz w:val="18"/>
-              <w:szCs w:val="16"/>
-            </w:rPr>
-            <w:t>3</w:t>
-          </w:r>
-          <w:r>
-            <w:rPr>
-              <w:sz w:val="18"/>
-              <w:szCs w:val="16"/>
-            </w:rPr>
-            <w:t>-26</w:t>
+            <w:t>/3-26</w:t>
           </w:r>
         </w:p>
         <w:p>
@@ -2595,6 +2610,7 @@
             <w:rPr>
               <w:sz w:val="20"/>
               <w:szCs w:val="20"/>
+              <w:lang w:val="en-US"/>
             </w:rPr>
           </w:pPr>
           <w:r>
@@ -2602,13 +2618,22 @@
               <w:sz w:val="16"/>
               <w:szCs w:val="16"/>
             </w:rPr>
-            <w:t xml:space="preserve">от </w:t>
+            <w:t>от</w:t>
+          </w:r>
+          <w:r>
+            <w:rPr>
+              <w:sz w:val="16"/>
+              <w:szCs w:val="16"/>
+              <w:lang w:val="en-US"/>
+            </w:rPr>
+            <w:t xml:space="preserve"> </w:t>
           </w:r>
           <w:r>
             <w:rPr>
               <w:noProof/>
               <w:sz w:val="18"/>
               <w:szCs w:val="16"/>
+              <w:lang w:val="en-US"/>
             </w:rPr>
             <w:t>{{OUTGOING_DATE}}</w:t>
           </w:r>
@@ -2619,6 +2644,9 @@
   <w:p>
     <w:pPr>
       <w:pStyle w:val="ab"/>
+      <w:rPr>
+        <w:lang w:val="en-US"/>
+      </w:rPr>
     </w:pPr>
   </w:p>
 </w:ftr>
@@ -2811,12 +2839,8 @@
 </file>
 
 <file path=word/header1.xml><?xml version="1.0" encoding="utf-8"?>
-<w:hdr xmlns:m="http://schemas.openxmlformats.org/officeDocument/2006/math" xmlns:mc="http://schemas.openxmlformats.org/markup-compatibility/2006" xmlns:mo="http://schemas.microsoft.com/office/mac/office/2008/main" xmlns:mv="urn:schemas-microsoft-com:mac:vml" xmlns:o="urn:schemas-microsoft-com:office:office" xmlns:r="http://schemas.openxmlformats.org/officeDocument/2006/relationships" xmlns:v="urn:schemas-microsoft-com:vml" xmlns:w10="urn:schemas-microsoft-com:office:word" xmlns:w14="http://schemas.microsoft.com/office/word/2010/wordml" xmlns:w="http://schemas.openxmlformats.org/wordprocessingml/2006/main" xmlns:wne="http://schemas.microsoft.com/office/word/2006/wordml" xmlns:wp14="http://schemas.microsoft.com/office/word/2010/wordprocessingDrawing" xmlns:wp="http://schemas.openxmlformats.org/drawingml/2006/wordprocessingDrawing" xmlns:wpc="http://schemas.microsoft.com/office/word/2010/wordprocessingCanvas" xmlns:wpg="http://schemas.microsoft.com/office/word/2010/wordprocessingGroup" xmlns:wpi="http://schemas.microsoft.com/office/word/2010/wordprocessingInk" xmlns:wps="http://schemas.microsoft.com/office/word/2010/wordprocessingShape" mc:Ignorable="w14 wp14">
-  <w:p>
-    <w:pPr>
-      <w:pStyle w:val="Header"/>
-    </w:pPr>
-  </w:p>
+<w:hdr xmlns:wpc="http://schemas.microsoft.com/office/word/2010/wordprocessingCanvas" xmlns:cx="http://schemas.microsoft.com/office/drawing/2014/chartex" xmlns:mc="http://schemas.openxmlformats.org/markup-compatibility/2006" xmlns:o="urn:schemas-microsoft-com:office:office" xmlns:r="http://schemas.openxmlformats.org/officeDocument/2006/relationships" xmlns:m="http://schemas.openxmlformats.org/officeDocument/2006/math" xmlns:v="urn:schemas-microsoft-com:vml" xmlns:wp14="http://schemas.microsoft.com/office/word/2010/wordprocessingDrawing" xmlns:wp="http://schemas.openxmlformats.org/drawingml/2006/wordprocessingDrawing" xmlns:w10="urn:schemas-microsoft-com:office:word" xmlns:w="http://schemas.openxmlformats.org/wordprocessingml/2006/main" xmlns:w14="http://schemas.microsoft.com/office/word/2010/wordml" xmlns:w15="http://schemas.microsoft.com/office/word/2012/wordml" xmlns:w16se="http://schemas.microsoft.com/office/word/2015/wordml/symex" xmlns:wpg="http://schemas.microsoft.com/office/word/2010/wordprocessingGroup" xmlns:wpi="http://schemas.microsoft.com/office/word/2010/wordprocessingInk" xmlns:wne="http://schemas.microsoft.com/office/word/2006/wordml" xmlns:wps="http://schemas.microsoft.com/office/word/2010/wordprocessingShape" mc:Ignorable="w14 w15 w16se wp14">
+  <w:p/>
 </w:hdr>
 </file>
 
@@ -4692,7 +4716,7 @@
 </file>
 
 <file path=customXml/itemProps1.xml><?xml version="1.0" encoding="utf-8"?>
-<ds:datastoreItem xmlns:ds="http://schemas.openxmlformats.org/officeDocument/2006/customXml" ds:itemID="{098DC580-1EF1-4039-B954-E6131D0BFCBA}">
+<ds:datastoreItem xmlns:ds="http://schemas.openxmlformats.org/officeDocument/2006/customXml" ds:itemID="{92EC8DB1-DC48-4AFE-AB98-C57BC5C31EAD}">
   <ds:schemaRefs>
     <ds:schemaRef ds:uri="http://schemas.openxmlformats.org/officeDocument/2006/bibliography"/>
   </ds:schemaRefs>

</xml_diff>